<commit_message>
feat: Update resume files to reflect recent changes and improvements
</commit_message>
<xml_diff>
--- a/Kenzy Ibrahim - Resume.docx
+++ b/Kenzy Ibrahim - Resume.docx
@@ -41,7 +41,7 @@
         </w:rPr>
         <w:t xml:space="preserve">  |  </w:t>
       </w:r>
-      <w:hyperlink w:history="1" r:id="rIdl6phl-g_9sqyceth6llxt">
+      <w:hyperlink w:history="1" r:id="rIdv542v3pgtmo3fmiv7__ua">
         <w:r>
           <w:rPr>
             <w:rFonts w:ascii="Calibri" w:cs="Calibri" w:eastAsia="Calibri" w:hAnsi="Calibri"/>
@@ -79,7 +79,7 @@
         </w:rPr>
         <w:t xml:space="preserve">  |  </w:t>
       </w:r>
-      <w:hyperlink w:history="1" r:id="rId4r7jn13bmegd9ab-0pvhd">
+      <w:hyperlink w:history="1" r:id="rIdz2xcqnsykq334hclujcjn">
         <w:r>
           <w:rPr>
             <w:rFonts w:ascii="Calibri" w:cs="Calibri" w:eastAsia="Calibri" w:hAnsi="Calibri"/>
@@ -100,7 +100,7 @@
         </w:rPr>
         <w:t xml:space="preserve">  |  </w:t>
       </w:r>
-      <w:hyperlink w:history="1" r:id="rIdsmthlgqc5akl773tsjdoi">
+      <w:hyperlink w:history="1" r:id="rIdit68kgld3m7i70x3vlnu0">
         <w:r>
           <w:rPr>
             <w:rFonts w:ascii="Calibri" w:cs="Calibri" w:eastAsia="Calibri" w:hAnsi="Calibri"/>
@@ -135,7 +135,7 @@
         <w:pBdr>
           <w:bottom w:val="single" w:color="2E4035" w:sz="8" w:space="1"/>
         </w:pBdr>
-        <w:spacing w:after="40" w:before="96"/>
+        <w:spacing w:after="34" w:before="82"/>
       </w:pPr>
       <w:r>
         <w:rPr>
@@ -212,7 +212,7 @@
           <w:ilvl w:val="0"/>
           <w:numId w:val="2"/>
         </w:numPr>
-        <w:spacing w:after="16" w:line="234"/>
+        <w:spacing w:after="10" w:line="214"/>
       </w:pPr>
       <w:r>
         <w:rPr>
@@ -240,7 +240,7 @@
           <w:ilvl w:val="0"/>
           <w:numId w:val="2"/>
         </w:numPr>
-        <w:spacing w:after="16" w:line="234"/>
+        <w:spacing w:after="10" w:line="214"/>
       </w:pPr>
       <w:r>
         <w:rPr>
@@ -258,7 +258,7 @@
           <w:ilvl w:val="0"/>
           <w:numId w:val="2"/>
         </w:numPr>
-        <w:spacing w:after="16" w:line="234"/>
+        <w:spacing w:after="10" w:line="214"/>
       </w:pPr>
       <w:r>
         <w:rPr>
@@ -284,7 +284,7 @@
         <w:pBdr>
           <w:bottom w:val="single" w:color="2E4035" w:sz="8" w:space="1"/>
         </w:pBdr>
-        <w:spacing w:after="40" w:before="96"/>
+        <w:spacing w:after="34" w:before="82"/>
       </w:pPr>
       <w:r>
         <w:rPr>
@@ -307,7 +307,7 @@
           <w:ilvl w:val="0"/>
           <w:numId w:val="2"/>
         </w:numPr>
-        <w:spacing w:after="16" w:line="234"/>
+        <w:spacing w:after="10" w:line="214"/>
       </w:pPr>
       <w:r>
         <w:rPr>
@@ -335,7 +335,7 @@
           <w:ilvl w:val="0"/>
           <w:numId w:val="2"/>
         </w:numPr>
-        <w:spacing w:after="16" w:line="234"/>
+        <w:spacing w:after="10" w:line="214"/>
       </w:pPr>
       <w:r>
         <w:rPr>
@@ -363,7 +363,7 @@
           <w:ilvl w:val="0"/>
           <w:numId w:val="2"/>
         </w:numPr>
-        <w:spacing w:after="16" w:line="234"/>
+        <w:spacing w:after="10" w:line="214"/>
       </w:pPr>
       <w:r>
         <w:rPr>
@@ -389,7 +389,7 @@
         <w:pBdr>
           <w:bottom w:val="single" w:color="2E4035" w:sz="8" w:space="1"/>
         </w:pBdr>
-        <w:spacing w:after="40" w:before="96"/>
+        <w:spacing w:after="34" w:before="82"/>
       </w:pPr>
       <w:r>
         <w:rPr>
@@ -466,7 +466,7 @@
           <w:ilvl w:val="0"/>
           <w:numId w:val="2"/>
         </w:numPr>
-        <w:spacing w:after="16" w:line="234"/>
+        <w:spacing w:after="10" w:line="214"/>
       </w:pPr>
       <w:r>
         <w:rPr>
@@ -484,7 +484,7 @@
           <w:ilvl w:val="0"/>
           <w:numId w:val="2"/>
         </w:numPr>
-        <w:spacing w:after="16" w:line="234"/>
+        <w:spacing w:after="10" w:line="214"/>
       </w:pPr>
       <w:r>
         <w:rPr>
@@ -556,51 +556,51 @@
           <w:ilvl w:val="0"/>
           <w:numId w:val="2"/>
         </w:numPr>
-        <w:spacing w:after="16" w:line="234"/>
-      </w:pPr>
-      <w:r>
-        <w:rPr>
-          <w:rFonts w:ascii="Calibri" w:cs="Calibri" w:eastAsia="Calibri" w:hAnsi="Calibri"/>
-          <w:sz w:val="19"/>
-          <w:szCs w:val="19"/>
-        </w:rPr>
-        <w:t xml:space="preserve">Led a cross-functional team of 8 through a 15-week lifecycle to deliver “Project Falcon,” a YOLOv8-powered computer vision solution that replaced manual telecom infrastructure inspections.</w:t>
-      </w:r>
-    </w:p>
-    <w:p>
-      <w:pPr>
-        <w:pStyle w:val="ListParagraph"/>
-        <w:numPr>
-          <w:ilvl w:val="0"/>
-          <w:numId w:val="2"/>
-        </w:numPr>
-        <w:spacing w:after="16" w:line="234"/>
-      </w:pPr>
-      <w:r>
-        <w:rPr>
-          <w:rFonts w:ascii="Calibri" w:cs="Calibri" w:eastAsia="Calibri" w:hAnsi="Calibri"/>
-          <w:sz w:val="19"/>
-          <w:szCs w:val="19"/>
-        </w:rPr>
-        <w:t xml:space="preserve">Translated compliance requirements from 4 senior stakeholders into technical features, designing a custom “Confidence Gating” algorithm that filtered low-quality inference and raised system reliability to 95%.</w:t>
-      </w:r>
-    </w:p>
-    <w:p>
-      <w:pPr>
-        <w:pStyle w:val="ListParagraph"/>
-        <w:numPr>
-          <w:ilvl w:val="0"/>
-          <w:numId w:val="2"/>
-        </w:numPr>
-        <w:spacing w:after="16" w:line="234"/>
-      </w:pPr>
-      <w:r>
-        <w:rPr>
-          <w:rFonts w:ascii="Calibri" w:cs="Calibri" w:eastAsia="Calibri" w:hAnsi="Calibri"/>
-          <w:sz w:val="19"/>
-          <w:szCs w:val="19"/>
-        </w:rPr>
-        <w:t xml:space="preserve">Directed the architecture of a fault-tolerant data ingestion pipeline with local caching for 2,000+ images, bypassing external API rate limits and reducing latency by 40%.</w:t>
+        <w:spacing w:after="10" w:line="214"/>
+      </w:pPr>
+      <w:r>
+        <w:rPr>
+          <w:rFonts w:ascii="Calibri" w:cs="Calibri" w:eastAsia="Calibri" w:hAnsi="Calibri"/>
+          <w:sz w:val="19"/>
+          <w:szCs w:val="19"/>
+        </w:rPr>
+        <w:t xml:space="preserve">Built “Project Falcon” with a cross-functional team of 8 over a 15-week Break Through Tech / Verizon AI Studio fellowship (Cornell Tech): an end-to-end YOLOv8 system detecting birds, nests, and species on cell towers for wildlife protection and regulatory compliance.</w:t>
+      </w:r>
+    </w:p>
+    <w:p>
+      <w:pPr>
+        <w:pStyle w:val="ListParagraph"/>
+        <w:numPr>
+          <w:ilvl w:val="0"/>
+          <w:numId w:val="2"/>
+        </w:numPr>
+        <w:spacing w:after="10" w:line="214"/>
+      </w:pPr>
+      <w:r>
+        <w:rPr>
+          <w:rFonts w:ascii="Calibri" w:cs="Calibri" w:eastAsia="Calibri" w:hAnsi="Calibri"/>
+          <w:sz w:val="19"/>
+          <w:szCs w:val="19"/>
+        </w:rPr>
+        <w:t xml:space="preserve">Merged and standardized 4 heterogeneous datasets (Roboflow, Hugging Face) into a unified YOLOv8 format, and built a ResNet50 “gatekeeper” classifier that filters images without towers before detection.</w:t>
+      </w:r>
+    </w:p>
+    <w:p>
+      <w:pPr>
+        <w:pStyle w:val="ListParagraph"/>
+        <w:numPr>
+          <w:ilvl w:val="0"/>
+          <w:numId w:val="2"/>
+        </w:numPr>
+        <w:spacing w:after="10" w:line="214"/>
+      </w:pPr>
+      <w:r>
+        <w:rPr>
+          <w:rFonts w:ascii="Calibri" w:cs="Calibri" w:eastAsia="Calibri" w:hAnsi="Calibri"/>
+          <w:sz w:val="19"/>
+          <w:szCs w:val="19"/>
+        </w:rPr>
+        <w:t xml:space="preserve">Owned dataset integration, YOLOv8 training, and metrics analysis, reaching 95%+ nest-detection precision and demonstrating that data quality outweighed model complexity.</w:t>
       </w:r>
     </w:p>
     <w:p>
@@ -664,25 +664,25 @@
           <w:ilvl w:val="0"/>
           <w:numId w:val="2"/>
         </w:numPr>
-        <w:spacing w:after="16" w:line="234"/>
-      </w:pPr>
-      <w:r>
-        <w:rPr>
-          <w:rFonts w:ascii="Calibri" w:cs="Calibri" w:eastAsia="Calibri" w:hAnsi="Calibri"/>
-          <w:sz w:val="19"/>
-          <w:szCs w:val="19"/>
-        </w:rPr>
-        <w:t xml:space="preserve">Improved user engagement 17% by redesigning the site’s visual style with a new color palette and updated UI components in HTML and CSS.</w:t>
-      </w:r>
-    </w:p>
-    <w:p>
-      <w:pPr>
-        <w:pStyle w:val="ListParagraph"/>
-        <w:numPr>
-          <w:ilvl w:val="0"/>
-          <w:numId w:val="2"/>
-        </w:numPr>
-        <w:spacing w:after="16" w:line="234"/>
+        <w:spacing w:after="10" w:line="214"/>
+      </w:pPr>
+      <w:r>
+        <w:rPr>
+          <w:rFonts w:ascii="Calibri" w:cs="Calibri" w:eastAsia="Calibri" w:hAnsi="Calibri"/>
+          <w:sz w:val="19"/>
+          <w:szCs w:val="19"/>
+        </w:rPr>
+        <w:t xml:space="preserve">Improved user engagement 17% by redesigning the site’s visual style with a new color palette and updated UI components in HTML/CSS.</w:t>
+      </w:r>
+    </w:p>
+    <w:p>
+      <w:pPr>
+        <w:pStyle w:val="ListParagraph"/>
+        <w:numPr>
+          <w:ilvl w:val="0"/>
+          <w:numId w:val="2"/>
+        </w:numPr>
+        <w:spacing w:after="10" w:line="214"/>
       </w:pPr>
       <w:r>
         <w:rPr>
@@ -700,7 +700,7 @@
           <w:ilvl w:val="0"/>
           <w:numId w:val="2"/>
         </w:numPr>
-        <w:spacing w:after="16" w:line="234"/>
+        <w:spacing w:after="10" w:line="214"/>
       </w:pPr>
       <w:r>
         <w:rPr>
@@ -716,7 +716,7 @@
         <w:pBdr>
           <w:bottom w:val="single" w:color="2E4035" w:sz="8" w:space="1"/>
         </w:pBdr>
-        <w:spacing w:after="40" w:before="96"/>
+        <w:spacing w:after="34" w:before="82"/>
       </w:pPr>
       <w:r>
         <w:rPr>
@@ -793,33 +793,51 @@
           <w:ilvl w:val="0"/>
           <w:numId w:val="2"/>
         </w:numPr>
-        <w:spacing w:after="16" w:line="234"/>
-      </w:pPr>
-      <w:r>
-        <w:rPr>
-          <w:rFonts w:ascii="Calibri" w:cs="Calibri" w:eastAsia="Calibri" w:hAnsi="Calibri"/>
-          <w:sz w:val="19"/>
-          <w:szCs w:val="19"/>
-        </w:rPr>
-        <w:t xml:space="preserve">Built a full-stack personal library application using React, MongoDB, and Google Cloud to power context-aware text analysis, guided Socratic seminars, and Smart Recaps across 10,000+ books from the BookLib API.</w:t>
-      </w:r>
-    </w:p>
-    <w:p>
-      <w:pPr>
-        <w:pStyle w:val="ListParagraph"/>
-        <w:numPr>
-          <w:ilvl w:val="0"/>
-          <w:numId w:val="2"/>
-        </w:numPr>
-        <w:spacing w:after="16" w:line="234"/>
-      </w:pPr>
-      <w:r>
-        <w:rPr>
-          <w:rFonts w:ascii="Calibri" w:cs="Calibri" w:eastAsia="Calibri" w:hAnsi="Calibri"/>
-          <w:sz w:val="19"/>
-          <w:szCs w:val="19"/>
-        </w:rPr>
-        <w:t xml:space="preserve">Designed a state-driven caching system to manage external API requests, eliminating redundant data calls and lowering operational costs.</w:t>
+        <w:spacing w:after="10" w:line="214"/>
+      </w:pPr>
+      <w:r>
+        <w:rPr>
+          <w:rFonts w:ascii="Calibri" w:cs="Calibri" w:eastAsia="Calibri" w:hAnsi="Calibri"/>
+          <w:sz w:val="19"/>
+          <w:szCs w:val="19"/>
+        </w:rPr>
+        <w:t xml:space="preserve">Built a full-stack reading companion (29 React components; Node/Express + MongoDB) with 4 AI tools — literary analysis, motif detection, page-aware "Smart Recaps," and a persistent Socratic-seminar chat; deployed on Google Cloud Run + Vercel with CI/CD.</w:t>
+      </w:r>
+    </w:p>
+    <w:p>
+      <w:pPr>
+        <w:pStyle w:val="ListParagraph"/>
+        <w:numPr>
+          <w:ilvl w:val="0"/>
+          <w:numId w:val="2"/>
+        </w:numPr>
+        <w:spacing w:after="10" w:line="214"/>
+      </w:pPr>
+      <w:r>
+        <w:rPr>
+          <w:rFonts w:ascii="Calibri" w:cs="Calibri" w:eastAsia="Calibri" w:hAnsi="Calibri"/>
+          <w:sz w:val="19"/>
+          <w:szCs w:val="19"/>
+        </w:rPr>
+        <w:t xml:space="preserve">Integrated the OpenLibrary API, a server-proxied LLM, and a reading-metrics dashboard over a 4-state library workflow (Want-to-Read, Reading, Finished, DNF); secured accounts with JWT + Google OAuth.</w:t>
+      </w:r>
+    </w:p>
+    <w:p>
+      <w:pPr>
+        <w:pStyle w:val="ListParagraph"/>
+        <w:numPr>
+          <w:ilvl w:val="0"/>
+          <w:numId w:val="2"/>
+        </w:numPr>
+        <w:spacing w:after="10" w:line="214"/>
+      </w:pPr>
+      <w:r>
+        <w:rPr>
+          <w:rFonts w:ascii="Calibri" w:cs="Calibri" w:eastAsia="Calibri" w:hAnsi="Calibri"/>
+          <w:sz w:val="19"/>
+          <w:szCs w:val="19"/>
+        </w:rPr>
+        <w:t xml:space="preserve">Engineered a MongoDB caching layer with conditional generation that regenerates AI content only when a reader's page advances, eliminating redundant LLM calls across all 4 tools and cutting API cost.</w:t>
       </w:r>
     </w:p>
     <w:p>
@@ -883,51 +901,69 @@
           <w:ilvl w:val="0"/>
           <w:numId w:val="2"/>
         </w:numPr>
-        <w:spacing w:after="16" w:line="234"/>
-      </w:pPr>
-      <w:r>
-        <w:rPr>
-          <w:rFonts w:ascii="Calibri" w:cs="Calibri" w:eastAsia="Calibri" w:hAnsi="Calibri"/>
-          <w:sz w:val="19"/>
-          <w:szCs w:val="19"/>
-        </w:rPr>
-        <w:t xml:space="preserve">Designed and launched a predictive web application (Python, Streamlit) to help emergency managers and first responders triage wildfire risk and prioritize community evacuations.</w:t>
-      </w:r>
-    </w:p>
-    <w:p>
-      <w:pPr>
-        <w:pStyle w:val="ListParagraph"/>
-        <w:numPr>
-          <w:ilvl w:val="0"/>
-          <w:numId w:val="2"/>
-        </w:numPr>
-        <w:spacing w:after="16" w:line="234"/>
-      </w:pPr>
-      <w:r>
-        <w:rPr>
-          <w:rFonts w:ascii="Calibri" w:cs="Calibri" w:eastAsia="Calibri" w:hAnsi="Calibri"/>
-          <w:sz w:val="19"/>
-          <w:szCs w:val="19"/>
-        </w:rPr>
-        <w:t xml:space="preserve">Engineered forecasting models using Random Survival Forests and Gradient Boosting Survival Analysis to predict evacuation threats across 12–72 hour horizons.</w:t>
-      </w:r>
-    </w:p>
-    <w:p>
-      <w:pPr>
-        <w:pStyle w:val="ListParagraph"/>
-        <w:numPr>
-          <w:ilvl w:val="0"/>
-          <w:numId w:val="2"/>
-        </w:numPr>
-        <w:spacing w:after="16" w:line="234"/>
-      </w:pPr>
-      <w:r>
-        <w:rPr>
-          <w:rFonts w:ascii="Calibri" w:cs="Calibri" w:eastAsia="Calibri" w:hAnsi="Calibri"/>
-          <w:sz w:val="19"/>
-          <w:szCs w:val="19"/>
-        </w:rPr>
-        <w:t xml:space="preserve">Trained and validated models on real-world WatchDuty data, optimizing for both comparative urgency (C-index) and exact probability calibration (Brier Score).</w:t>
+        <w:spacing w:after="10" w:line="214"/>
+      </w:pPr>
+      <w:r>
+        <w:rPr>
+          <w:rFonts w:ascii="Calibri" w:cs="Calibri" w:eastAsia="Calibri" w:hAnsi="Calibri"/>
+          <w:sz w:val="19"/>
+          <w:szCs w:val="19"/>
+        </w:rPr>
+        <w:t xml:space="preserve">Built a survival-analysis web app (Python, Streamlit, scikit-survival) that forecasts the probability of a wildfire reaching an evacuation zone at 12/24/48/72-hour horizons.</w:t>
+      </w:r>
+    </w:p>
+    <w:p>
+      <w:pPr>
+        <w:pStyle w:val="ListParagraph"/>
+        <w:numPr>
+          <w:ilvl w:val="0"/>
+          <w:numId w:val="2"/>
+        </w:numPr>
+        <w:spacing w:after="10" w:line="214"/>
+      </w:pPr>
+      <w:r>
+        <w:rPr>
+          <w:rFonts w:ascii="Calibri" w:cs="Calibri" w:eastAsia="Calibri" w:hAnsi="Calibri"/>
+          <w:sz w:val="19"/>
+          <w:szCs w:val="19"/>
+        </w:rPr>
+        <w:t xml:space="preserve">Engineered 16 domain-informed features from first-5-hour fire telemetry (closing speed, area growth rate, ETA-to-threshold, directed-threat index).</w:t>
+      </w:r>
+    </w:p>
+    <w:p>
+      <w:pPr>
+        <w:pStyle w:val="ListParagraph"/>
+        <w:numPr>
+          <w:ilvl w:val="0"/>
+          <w:numId w:val="2"/>
+        </w:numPr>
+        <w:spacing w:after="10" w:line="214"/>
+      </w:pPr>
+      <w:r>
+        <w:rPr>
+          <w:rFonts w:ascii="Calibri" w:cs="Calibri" w:eastAsia="Calibri" w:hAnsi="Calibri"/>
+          <w:sz w:val="19"/>
+          <w:szCs w:val="19"/>
+        </w:rPr>
+        <w:t xml:space="preserve">Ensembled a Random Survival Forest with a Gradient Boosting survival model, validating on real WatchDuty data via concordance index (C-index) and Brier-score calibration.</w:t>
+      </w:r>
+    </w:p>
+    <w:p>
+      <w:pPr>
+        <w:pStyle w:val="ListParagraph"/>
+        <w:numPr>
+          <w:ilvl w:val="0"/>
+          <w:numId w:val="2"/>
+        </w:numPr>
+        <w:spacing w:after="10" w:line="214"/>
+      </w:pPr>
+      <w:r>
+        <w:rPr>
+          <w:rFonts w:ascii="Calibri" w:cs="Calibri" w:eastAsia="Calibri" w:hAnsi="Calibri"/>
+          <w:sz w:val="19"/>
+          <w:szCs w:val="19"/>
+        </w:rPr>
+        <w:t xml:space="preserve">Shipped it as an interactive Streamlit dashboard (Streamlit Community Cloud) that turns 6 real-time telemetry inputs into per-horizon threat scores and a triage-ready risk readout.</w:t>
       </w:r>
     </w:p>
     <w:p>
@@ -935,7 +971,7 @@
         <w:pBdr>
           <w:bottom w:val="single" w:color="2E4035" w:sz="8" w:space="1"/>
         </w:pBdr>
-        <w:spacing w:after="40" w:before="96"/>
+        <w:spacing w:after="34" w:before="82"/>
       </w:pPr>
       <w:r>
         <w:rPr>
@@ -1012,7 +1048,7 @@
           <w:ilvl w:val="0"/>
           <w:numId w:val="2"/>
         </w:numPr>
-        <w:spacing w:after="16" w:line="234"/>
+        <w:spacing w:after="10" w:line="214"/>
       </w:pPr>
       <w:r>
         <w:rPr>
@@ -1030,7 +1066,7 @@
           <w:ilvl w:val="0"/>
           <w:numId w:val="2"/>
         </w:numPr>
-        <w:spacing w:after="16" w:line="234"/>
+        <w:spacing w:after="10" w:line="214"/>
       </w:pPr>
       <w:r>
         <w:rPr>
@@ -1043,7 +1079,7 @@
     </w:p>
     <w:sectPr>
       <w:pgSz w:w="12240" w:h="15840" w:orient="portrait"/>
-      <w:pgMar w:top="470" w:right="720" w:bottom="470" w:left="720" w:header="708" w:footer="708" w:gutter="0"/>
+      <w:pgMar w:top="430" w:right="720" w:bottom="400" w:left="720" w:header="708" w:footer="708" w:gutter="0"/>
       <w:pgNumType/>
       <w:docGrid w:linePitch="360"/>
     </w:sectPr>

</xml_diff>